<commit_message>
Added some files in Communication Skills
</commit_message>
<xml_diff>
--- a/Object Oriented Programming/Object Oriented Programming Lab (CSL-210)/Lab No 02/Object Oriented Programming Lab 02.docx
+++ b/Object Oriented Programming/Object Oriented Programming Lab (CSL-210)/Lab No 02/Object Oriented Programming Lab 02.docx
@@ -4,20 +4,59 @@
   <w:body>
     <w:p>
       <w:pPr>
-        <w:spacing w:line="240" w:lineRule="auto"/>
-        <w:rPr>
-          <w:rFonts w:ascii="Britannic Bold" w:hAnsi="Britannic Bold"/>
+        <w:spacing w:line="256" w:lineRule="auto"/>
+        <w:jc w:val="both"/>
+        <w:rPr>
+          <w:rFonts w:ascii="Times New Roman" w:hAnsi="Times New Roman" w:cs="Times New Roman"/>
+          <w:color w:val="000000" w:themeColor="text1"/>
+          <w:sz w:val="28"/>
+          <w:szCs w:val="28"/>
+        </w:rPr>
+      </w:pPr>
+      <w:r>
+        <w:rPr>
+          <w:rFonts w:ascii="Britannic Bold" w:hAnsi="Britannic Bold"/>
+          <w:color w:val="000000" w:themeColor="text1"/>
           <w:sz w:val="32"/>
           <w:szCs w:val="32"/>
         </w:rPr>
-      </w:pPr>
-      <w:r>
-        <w:rPr>
-          <w:rFonts w:ascii="Britannic Bold" w:hAnsi="Britannic Bold"/>
+        <w:t>Task No 01:</w:t>
+      </w:r>
+      <w:r>
+        <w:rPr>
+          <w:rFonts w:ascii="Britannic Bold" w:hAnsi="Britannic Bold"/>
+          <w:color w:val="000000" w:themeColor="text1"/>
           <w:sz w:val="32"/>
           <w:szCs w:val="32"/>
         </w:rPr>
-        <w:t>Task No 01:</w:t>
+        <w:t xml:space="preserve"> </w:t>
+      </w:r>
+      <w:r>
+        <w:rPr>
+          <w:rFonts w:ascii="Times New Roman" w:hAnsi="Times New Roman" w:cs="Times New Roman"/>
+          <w:color w:val="000000" w:themeColor="text1"/>
+          <w:sz w:val="28"/>
+          <w:szCs w:val="28"/>
+        </w:rPr>
+        <w:t xml:space="preserve">Create a class student which contains the basic data about the student that takes the basic student data and displays it by using display method. An option of update is being provided to the user if he/she </w:t>
+      </w:r>
+      <w:r>
+        <w:rPr>
+          <w:rFonts w:ascii="Times New Roman" w:hAnsi="Times New Roman" w:cs="Times New Roman"/>
+          <w:color w:val="000000" w:themeColor="text1"/>
+          <w:sz w:val="28"/>
+          <w:szCs w:val="28"/>
+        </w:rPr>
+        <w:t>wants</w:t>
+      </w:r>
+      <w:r>
+        <w:rPr>
+          <w:rFonts w:ascii="Times New Roman" w:hAnsi="Times New Roman" w:cs="Times New Roman"/>
+          <w:color w:val="000000" w:themeColor="text1"/>
+          <w:sz w:val="28"/>
+          <w:szCs w:val="28"/>
+        </w:rPr>
+        <w:t xml:space="preserve"> to update the data, the required data being updated.</w:t>
       </w:r>
     </w:p>
     <w:p>
@@ -25,13 +64,15 @@
         <w:spacing w:after="0"/>
         <w:rPr>
           <w:rFonts w:ascii="Britannic Bold" w:hAnsi="Britannic Bold"/>
-          <w:sz w:val="28"/>
-          <w:szCs w:val="28"/>
-        </w:rPr>
-      </w:pPr>
-      <w:r>
-        <w:rPr>
-          <w:rFonts w:ascii="Britannic Bold" w:hAnsi="Britannic Bold"/>
+          <w:color w:val="000000" w:themeColor="text1"/>
+          <w:sz w:val="28"/>
+          <w:szCs w:val="28"/>
+        </w:rPr>
+      </w:pPr>
+      <w:r>
+        <w:rPr>
+          <w:rFonts w:ascii="Britannic Bold" w:hAnsi="Britannic Bold"/>
+          <w:color w:val="000000" w:themeColor="text1"/>
           <w:sz w:val="28"/>
           <w:szCs w:val="28"/>
         </w:rPr>
@@ -40,6 +81,7 @@
       <w:r>
         <w:rPr>
           <w:rFonts w:ascii="Britannic Bold" w:hAnsi="Britannic Bold"/>
+          <w:color w:val="000000" w:themeColor="text1"/>
           <w:sz w:val="28"/>
           <w:szCs w:val="28"/>
         </w:rPr>
@@ -50,22 +92,903 @@
       <w:pPr>
         <w:rPr>
           <w:rFonts w:ascii="Britannic Bold" w:hAnsi="Britannic Bold"/>
-          <w:sz w:val="28"/>
-          <w:szCs w:val="28"/>
-        </w:rPr>
-      </w:pPr>
-      <w:r>
-        <w:rPr>
-          <w:rFonts w:ascii="Britannic Bold" w:hAnsi="Britannic Bold"/>
+          <w:color w:val="000000" w:themeColor="text1"/>
+          <w:sz w:val="28"/>
+          <w:szCs w:val="28"/>
+        </w:rPr>
+      </w:pPr>
+      <w:r>
+        <w:rPr>
+          <w:rFonts w:ascii="Britannic Bold" w:hAnsi="Britannic Bold"/>
+          <w:color w:val="000000" w:themeColor="text1"/>
           <w:sz w:val="28"/>
           <w:szCs w:val="28"/>
         </w:rPr>
         <w:t>Output:</w:t>
       </w:r>
     </w:p>
+    <w:p>
+      <w:pPr>
+        <w:jc w:val="both"/>
+        <w:rPr>
+          <w:rFonts w:ascii="Times New Roman" w:hAnsi="Times New Roman" w:cs="Times New Roman"/>
+          <w:color w:val="000000" w:themeColor="text1"/>
+          <w:sz w:val="28"/>
+          <w:szCs w:val="28"/>
+        </w:rPr>
+      </w:pPr>
+      <w:r>
+        <w:rPr>
+          <w:rFonts w:ascii="Britannic Bold" w:hAnsi="Britannic Bold"/>
+          <w:color w:val="000000" w:themeColor="text1"/>
+          <w:sz w:val="32"/>
+          <w:szCs w:val="32"/>
+        </w:rPr>
+        <w:t>Task No 0</w:t>
+      </w:r>
+      <w:r>
+        <w:rPr>
+          <w:rFonts w:ascii="Britannic Bold" w:hAnsi="Britannic Bold"/>
+          <w:color w:val="000000" w:themeColor="text1"/>
+          <w:sz w:val="32"/>
+          <w:szCs w:val="32"/>
+        </w:rPr>
+        <w:t>2</w:t>
+      </w:r>
+      <w:r>
+        <w:rPr>
+          <w:rFonts w:ascii="Britannic Bold" w:hAnsi="Britannic Bold"/>
+          <w:color w:val="000000" w:themeColor="text1"/>
+          <w:sz w:val="32"/>
+          <w:szCs w:val="32"/>
+        </w:rPr>
+        <w:t xml:space="preserve">: </w:t>
+      </w:r>
+      <w:r>
+        <w:rPr>
+          <w:rFonts w:ascii="Times New Roman" w:hAnsi="Times New Roman" w:cs="Times New Roman"/>
+          <w:color w:val="000000" w:themeColor="text1"/>
+          <w:sz w:val="28"/>
+          <w:szCs w:val="28"/>
+        </w:rPr>
+        <w:t>Create a class “computer” which contains specifications of computer, the program shall ask the user does he/she wants to open the system, if the user press “yes” then the system starts shows the initial loading and then displays the basic configuration of a system (by calling the method of display () , update option is being provided by the user, values of the specified items  are being  updated once user decides to update that item.</w:t>
+      </w:r>
+    </w:p>
+    <w:p>
+      <w:pPr>
+        <w:spacing w:line="256" w:lineRule="auto"/>
+        <w:jc w:val="both"/>
+        <w:rPr>
+          <w:rFonts w:ascii="Britannic Bold" w:hAnsi="Britannic Bold"/>
+          <w:color w:val="000000" w:themeColor="text1"/>
+          <w:sz w:val="28"/>
+          <w:szCs w:val="28"/>
+        </w:rPr>
+      </w:pPr>
+      <w:r>
+        <w:rPr>
+          <w:rFonts w:ascii="Britannic Bold" w:hAnsi="Britannic Bold"/>
+          <w:color w:val="000000" w:themeColor="text1"/>
+          <w:sz w:val="28"/>
+          <w:szCs w:val="28"/>
+        </w:rPr>
+        <w:t>Code:</w:t>
+      </w:r>
+    </w:p>
+    <w:p>
+      <w:pPr>
+        <w:rPr>
+          <w:rFonts w:ascii="Britannic Bold" w:hAnsi="Britannic Bold"/>
+          <w:color w:val="000000" w:themeColor="text1"/>
+          <w:sz w:val="28"/>
+          <w:szCs w:val="28"/>
+        </w:rPr>
+      </w:pPr>
+      <w:r>
+        <w:rPr>
+          <w:rFonts w:ascii="Britannic Bold" w:hAnsi="Britannic Bold"/>
+          <w:color w:val="000000" w:themeColor="text1"/>
+          <w:sz w:val="28"/>
+          <w:szCs w:val="28"/>
+        </w:rPr>
+        <w:t>Output:</w:t>
+      </w:r>
+    </w:p>
+    <w:p>
+      <w:pPr>
+        <w:jc w:val="both"/>
+        <w:rPr>
+          <w:rFonts w:ascii="Times New Roman" w:hAnsi="Times New Roman" w:cs="Times New Roman"/>
+          <w:color w:val="000000" w:themeColor="text1"/>
+          <w:sz w:val="28"/>
+          <w:szCs w:val="28"/>
+        </w:rPr>
+      </w:pPr>
+      <w:r>
+        <w:rPr>
+          <w:rFonts w:ascii="Britannic Bold" w:hAnsi="Britannic Bold"/>
+          <w:color w:val="000000" w:themeColor="text1"/>
+          <w:sz w:val="32"/>
+          <w:szCs w:val="32"/>
+        </w:rPr>
+        <w:t>Task No 0</w:t>
+      </w:r>
+      <w:r>
+        <w:rPr>
+          <w:rFonts w:ascii="Britannic Bold" w:hAnsi="Britannic Bold"/>
+          <w:color w:val="000000" w:themeColor="text1"/>
+          <w:sz w:val="32"/>
+          <w:szCs w:val="32"/>
+        </w:rPr>
+        <w:t>3</w:t>
+      </w:r>
+      <w:r>
+        <w:rPr>
+          <w:rFonts w:ascii="Britannic Bold" w:hAnsi="Britannic Bold"/>
+          <w:color w:val="000000" w:themeColor="text1"/>
+          <w:sz w:val="32"/>
+          <w:szCs w:val="32"/>
+        </w:rPr>
+        <w:t xml:space="preserve">: </w:t>
+      </w:r>
+      <w:r>
+        <w:rPr>
+          <w:rFonts w:ascii="Times New Roman" w:hAnsi="Times New Roman" w:cs="Times New Roman"/>
+          <w:color w:val="000000" w:themeColor="text1"/>
+          <w:sz w:val="28"/>
+          <w:szCs w:val="28"/>
+        </w:rPr>
+        <w:t xml:space="preserve">Create a class of Employee which contains basic information about an employee, employee name, father’s name and salary </w:t>
+      </w:r>
+      <w:r>
+        <w:rPr>
+          <w:rFonts w:ascii="Times New Roman" w:hAnsi="Times New Roman" w:cs="Times New Roman"/>
+          <w:color w:val="000000" w:themeColor="text1"/>
+          <w:sz w:val="28"/>
+          <w:szCs w:val="28"/>
+        </w:rPr>
+        <w:t>etc.</w:t>
+      </w:r>
+      <w:r>
+        <w:rPr>
+          <w:rFonts w:ascii="Times New Roman" w:hAnsi="Times New Roman" w:cs="Times New Roman"/>
+          <w:color w:val="000000" w:themeColor="text1"/>
+          <w:sz w:val="28"/>
+          <w:szCs w:val="28"/>
+        </w:rPr>
+        <w:t xml:space="preserve"> are being displayed by the display method and the salary of employees </w:t>
+      </w:r>
+      <w:r>
+        <w:rPr>
+          <w:rFonts w:ascii="Times New Roman" w:hAnsi="Times New Roman" w:cs="Times New Roman"/>
+          <w:color w:val="000000" w:themeColor="text1"/>
+          <w:sz w:val="28"/>
+          <w:szCs w:val="28"/>
+        </w:rPr>
+        <w:t>or the</w:t>
+      </w:r>
+      <w:r>
+        <w:rPr>
+          <w:rFonts w:ascii="Times New Roman" w:hAnsi="Times New Roman" w:cs="Times New Roman"/>
+          <w:color w:val="000000" w:themeColor="text1"/>
+          <w:sz w:val="28"/>
+          <w:szCs w:val="28"/>
+        </w:rPr>
+        <w:t xml:space="preserve"> designation  of the employees are being set/updated as per need.</w:t>
+      </w:r>
+    </w:p>
+    <w:p>
+      <w:pPr>
+        <w:spacing w:line="256" w:lineRule="auto"/>
+        <w:jc w:val="both"/>
+        <w:rPr>
+          <w:rFonts w:ascii="Britannic Bold" w:hAnsi="Britannic Bold"/>
+          <w:color w:val="000000" w:themeColor="text1"/>
+          <w:sz w:val="28"/>
+          <w:szCs w:val="28"/>
+        </w:rPr>
+      </w:pPr>
+      <w:r>
+        <w:rPr>
+          <w:rFonts w:ascii="Britannic Bold" w:hAnsi="Britannic Bold"/>
+          <w:color w:val="000000" w:themeColor="text1"/>
+          <w:sz w:val="28"/>
+          <w:szCs w:val="28"/>
+        </w:rPr>
+        <w:t>Code:</w:t>
+      </w:r>
+    </w:p>
+    <w:p>
+      <w:pPr>
+        <w:rPr>
+          <w:rFonts w:ascii="Britannic Bold" w:hAnsi="Britannic Bold"/>
+          <w:color w:val="000000" w:themeColor="text1"/>
+          <w:sz w:val="28"/>
+          <w:szCs w:val="28"/>
+        </w:rPr>
+      </w:pPr>
+      <w:r>
+        <w:rPr>
+          <w:rFonts w:ascii="Britannic Bold" w:hAnsi="Britannic Bold"/>
+          <w:color w:val="000000" w:themeColor="text1"/>
+          <w:sz w:val="28"/>
+          <w:szCs w:val="28"/>
+        </w:rPr>
+        <w:t>Output:</w:t>
+      </w:r>
+    </w:p>
+    <w:p>
+      <w:pPr>
+        <w:jc w:val="both"/>
+        <w:rPr>
+          <w:rFonts w:ascii="Times New Roman" w:hAnsi="Times New Roman" w:cs="Times New Roman"/>
+          <w:color w:val="000000" w:themeColor="text1"/>
+          <w:sz w:val="28"/>
+          <w:szCs w:val="28"/>
+        </w:rPr>
+      </w:pPr>
+      <w:r>
+        <w:rPr>
+          <w:rFonts w:ascii="Britannic Bold" w:hAnsi="Britannic Bold"/>
+          <w:color w:val="000000" w:themeColor="text1"/>
+          <w:sz w:val="32"/>
+          <w:szCs w:val="32"/>
+        </w:rPr>
+        <w:t>Task No 0</w:t>
+      </w:r>
+      <w:r>
+        <w:rPr>
+          <w:rFonts w:ascii="Britannic Bold" w:hAnsi="Britannic Bold"/>
+          <w:color w:val="000000" w:themeColor="text1"/>
+          <w:sz w:val="32"/>
+          <w:szCs w:val="32"/>
+        </w:rPr>
+        <w:t>4</w:t>
+      </w:r>
+      <w:r>
+        <w:rPr>
+          <w:rFonts w:ascii="Britannic Bold" w:hAnsi="Britannic Bold"/>
+          <w:color w:val="000000" w:themeColor="text1"/>
+          <w:sz w:val="32"/>
+          <w:szCs w:val="32"/>
+        </w:rPr>
+        <w:t xml:space="preserve">: </w:t>
+      </w:r>
+      <w:r>
+        <w:rPr>
+          <w:rFonts w:ascii="Times New Roman" w:hAnsi="Times New Roman" w:cs="Times New Roman"/>
+          <w:color w:val="000000" w:themeColor="text1"/>
+          <w:sz w:val="28"/>
+          <w:szCs w:val="28"/>
+        </w:rPr>
+        <w:t>Create a class of Automobile which contains specifications of a car, check whether  the car is in     -  ON/start state if not them asks the user if he/she want to start the car, If the car is already in start state  then first display the current status of the car which includes the horse power, color, made, engine type etc. providing an option to the user if he/she wants to update any of the mentioned part from the car, if user selects “YES” then it is updated according to the need of the user, else the program will be ended.</w:t>
+      </w:r>
+    </w:p>
+    <w:p>
+      <w:pPr>
+        <w:spacing w:line="256" w:lineRule="auto"/>
+        <w:jc w:val="both"/>
+        <w:rPr>
+          <w:rFonts w:ascii="Britannic Bold" w:hAnsi="Britannic Bold"/>
+          <w:color w:val="000000" w:themeColor="text1"/>
+          <w:sz w:val="28"/>
+          <w:szCs w:val="28"/>
+        </w:rPr>
+      </w:pPr>
+      <w:r>
+        <w:rPr>
+          <w:rFonts w:ascii="Britannic Bold" w:hAnsi="Britannic Bold"/>
+          <w:color w:val="000000" w:themeColor="text1"/>
+          <w:sz w:val="28"/>
+          <w:szCs w:val="28"/>
+        </w:rPr>
+        <w:t>Code:</w:t>
+      </w:r>
+    </w:p>
+    <w:p>
+      <w:pPr>
+        <w:rPr>
+          <w:rFonts w:ascii="Britannic Bold" w:hAnsi="Britannic Bold"/>
+          <w:color w:val="000000" w:themeColor="text1"/>
+          <w:sz w:val="28"/>
+          <w:szCs w:val="28"/>
+        </w:rPr>
+      </w:pPr>
+      <w:r>
+        <w:rPr>
+          <w:rFonts w:ascii="Britannic Bold" w:hAnsi="Britannic Bold"/>
+          <w:color w:val="000000" w:themeColor="text1"/>
+          <w:sz w:val="28"/>
+          <w:szCs w:val="28"/>
+        </w:rPr>
+        <w:t>Output:</w:t>
+      </w:r>
+    </w:p>
+    <w:p>
+      <w:pPr>
+        <w:spacing w:after="0" w:line="240" w:lineRule="auto"/>
+        <w:jc w:val="both"/>
+        <w:rPr>
+          <w:rFonts w:ascii="Times New Roman" w:hAnsi="Times New Roman" w:cs="Times New Roman"/>
+          <w:color w:val="000000" w:themeColor="text1"/>
+          <w:sz w:val="28"/>
+          <w:szCs w:val="28"/>
+        </w:rPr>
+      </w:pPr>
+      <w:r>
+        <w:rPr>
+          <w:rFonts w:ascii="Britannic Bold" w:hAnsi="Britannic Bold"/>
+          <w:color w:val="000000" w:themeColor="text1"/>
+          <w:sz w:val="32"/>
+          <w:szCs w:val="32"/>
+        </w:rPr>
+        <w:t>Task No 0</w:t>
+      </w:r>
+      <w:r>
+        <w:rPr>
+          <w:rFonts w:ascii="Britannic Bold" w:hAnsi="Britannic Bold"/>
+          <w:color w:val="000000" w:themeColor="text1"/>
+          <w:sz w:val="32"/>
+          <w:szCs w:val="32"/>
+        </w:rPr>
+        <w:t>5</w:t>
+      </w:r>
+      <w:r>
+        <w:rPr>
+          <w:rFonts w:ascii="Britannic Bold" w:hAnsi="Britannic Bold"/>
+          <w:color w:val="000000" w:themeColor="text1"/>
+          <w:sz w:val="32"/>
+          <w:szCs w:val="32"/>
+        </w:rPr>
+        <w:t xml:space="preserve">: </w:t>
+      </w:r>
+      <w:r>
+        <w:rPr>
+          <w:rFonts w:ascii="Times New Roman" w:hAnsi="Times New Roman" w:cs="Times New Roman"/>
+          <w:color w:val="000000" w:themeColor="text1"/>
+          <w:sz w:val="28"/>
+          <w:szCs w:val="28"/>
+        </w:rPr>
+        <w:t>Implement a class Car, that has the</w:t>
+      </w:r>
+      <w:r>
+        <w:rPr>
+          <w:rFonts w:ascii="Times New Roman" w:hAnsi="Times New Roman" w:cs="Times New Roman"/>
+          <w:color w:val="000000" w:themeColor="text1"/>
+          <w:sz w:val="28"/>
+          <w:szCs w:val="28"/>
+        </w:rPr>
+        <w:t xml:space="preserve"> </w:t>
+      </w:r>
+      <w:r>
+        <w:rPr>
+          <w:rFonts w:ascii="Times New Roman" w:hAnsi="Times New Roman" w:cs="Times New Roman"/>
+          <w:color w:val="000000" w:themeColor="text1"/>
+          <w:sz w:val="28"/>
+          <w:szCs w:val="28"/>
+        </w:rPr>
+        <w:t xml:space="preserve">characteristics </w:t>
+      </w:r>
+      <w:proofErr w:type="spellStart"/>
+      <w:r>
+        <w:rPr>
+          <w:rFonts w:ascii="Times New Roman" w:hAnsi="Times New Roman" w:cs="Times New Roman"/>
+          <w:color w:val="000000" w:themeColor="text1"/>
+          <w:sz w:val="28"/>
+          <w:szCs w:val="28"/>
+        </w:rPr>
+        <w:t>Brandname</w:t>
+      </w:r>
+      <w:proofErr w:type="spellEnd"/>
+      <w:r>
+        <w:rPr>
+          <w:rFonts w:ascii="Times New Roman" w:hAnsi="Times New Roman" w:cs="Times New Roman"/>
+          <w:color w:val="000000" w:themeColor="text1"/>
+          <w:sz w:val="28"/>
+          <w:szCs w:val="28"/>
+        </w:rPr>
+        <w:t xml:space="preserve">, </w:t>
+      </w:r>
+      <w:proofErr w:type="spellStart"/>
+      <w:r>
+        <w:rPr>
+          <w:rFonts w:ascii="Times New Roman" w:hAnsi="Times New Roman" w:cs="Times New Roman"/>
+          <w:color w:val="000000" w:themeColor="text1"/>
+          <w:sz w:val="28"/>
+          <w:szCs w:val="28"/>
+        </w:rPr>
+        <w:t>PriceNew</w:t>
+      </w:r>
+      <w:proofErr w:type="spellEnd"/>
+      <w:r>
+        <w:rPr>
+          <w:rFonts w:ascii="Times New Roman" w:hAnsi="Times New Roman" w:cs="Times New Roman"/>
+          <w:color w:val="000000" w:themeColor="text1"/>
+          <w:sz w:val="28"/>
+          <w:szCs w:val="28"/>
+        </w:rPr>
+        <w:t xml:space="preserve"> (which</w:t>
+      </w:r>
+      <w:r>
+        <w:rPr>
+          <w:rFonts w:ascii="Times New Roman" w:hAnsi="Times New Roman" w:cs="Times New Roman"/>
+          <w:color w:val="000000" w:themeColor="text1"/>
+          <w:sz w:val="28"/>
+          <w:szCs w:val="28"/>
+        </w:rPr>
+        <w:t xml:space="preserve"> represents the price of the car when it was new</w:t>
+      </w:r>
+      <w:r>
+        <w:rPr>
+          <w:rFonts w:ascii="Times New Roman" w:hAnsi="Times New Roman" w:cs="Times New Roman"/>
+          <w:color w:val="000000" w:themeColor="text1"/>
+          <w:sz w:val="28"/>
+          <w:szCs w:val="28"/>
+        </w:rPr>
+        <w:t>)</w:t>
+      </w:r>
+      <w:r>
+        <w:rPr>
+          <w:rFonts w:ascii="Times New Roman" w:hAnsi="Times New Roman" w:cs="Times New Roman"/>
+          <w:color w:val="000000" w:themeColor="text1"/>
+          <w:sz w:val="28"/>
+          <w:szCs w:val="28"/>
+        </w:rPr>
+        <w:t xml:space="preserve">, </w:t>
+      </w:r>
+      <w:r>
+        <w:rPr>
+          <w:rFonts w:ascii="Times New Roman" w:hAnsi="Times New Roman" w:cs="Times New Roman"/>
+          <w:color w:val="000000" w:themeColor="text1"/>
+          <w:sz w:val="28"/>
+          <w:szCs w:val="28"/>
+        </w:rPr>
+        <w:t>Color and</w:t>
+      </w:r>
+      <w:r>
+        <w:rPr>
+          <w:rFonts w:ascii="Times New Roman" w:hAnsi="Times New Roman" w:cs="Times New Roman"/>
+          <w:color w:val="000000" w:themeColor="text1"/>
+          <w:sz w:val="28"/>
+          <w:szCs w:val="28"/>
+        </w:rPr>
+        <w:t xml:space="preserve"> </w:t>
+      </w:r>
+      <w:r>
+        <w:rPr>
+          <w:rFonts w:ascii="Times New Roman" w:hAnsi="Times New Roman" w:cs="Times New Roman"/>
+          <w:color w:val="000000" w:themeColor="text1"/>
+          <w:sz w:val="28"/>
+          <w:szCs w:val="28"/>
+        </w:rPr>
+        <w:lastRenderedPageBreak/>
+        <w:t>Odometer</w:t>
+      </w:r>
+      <w:r>
+        <w:rPr>
+          <w:rFonts w:ascii="Times New Roman" w:hAnsi="Times New Roman" w:cs="Times New Roman"/>
+          <w:color w:val="000000" w:themeColor="text1"/>
+          <w:sz w:val="28"/>
+          <w:szCs w:val="28"/>
+        </w:rPr>
+        <w:t xml:space="preserve"> (</w:t>
+      </w:r>
+      <w:r>
+        <w:rPr>
+          <w:rFonts w:ascii="Times New Roman" w:hAnsi="Times New Roman" w:cs="Times New Roman"/>
+          <w:color w:val="000000" w:themeColor="text1"/>
+          <w:sz w:val="28"/>
+          <w:szCs w:val="28"/>
+        </w:rPr>
+        <w:t>which is milo meter shows number of milage travelled by car</w:t>
+      </w:r>
+      <w:r>
+        <w:rPr>
+          <w:rFonts w:ascii="Times New Roman" w:hAnsi="Times New Roman" w:cs="Times New Roman"/>
+          <w:color w:val="000000" w:themeColor="text1"/>
+          <w:sz w:val="28"/>
+          <w:szCs w:val="28"/>
+        </w:rPr>
+        <w:t>)</w:t>
+      </w:r>
+      <w:r>
+        <w:rPr>
+          <w:rFonts w:ascii="Times New Roman" w:hAnsi="Times New Roman" w:cs="Times New Roman"/>
+          <w:color w:val="000000" w:themeColor="text1"/>
+          <w:sz w:val="28"/>
+          <w:szCs w:val="28"/>
+        </w:rPr>
+        <w:t xml:space="preserve">. </w:t>
+      </w:r>
+      <w:r>
+        <w:rPr>
+          <w:rFonts w:ascii="Times New Roman" w:hAnsi="Times New Roman" w:cs="Times New Roman"/>
+          <w:color w:val="000000" w:themeColor="text1"/>
+          <w:sz w:val="28"/>
+          <w:szCs w:val="28"/>
+        </w:rPr>
+        <w:t>The class should have:</w:t>
+      </w:r>
+    </w:p>
+    <w:p>
+      <w:pPr>
+        <w:pStyle w:val="ListParagraph"/>
+        <w:numPr>
+          <w:ilvl w:val="0"/>
+          <w:numId w:val="3"/>
+        </w:numPr>
+        <w:spacing w:after="0" w:line="240" w:lineRule="auto"/>
+        <w:jc w:val="both"/>
+        <w:rPr>
+          <w:rFonts w:ascii="Times New Roman" w:hAnsi="Times New Roman" w:cs="Times New Roman"/>
+          <w:color w:val="000000" w:themeColor="text1"/>
+          <w:sz w:val="28"/>
+          <w:szCs w:val="28"/>
+        </w:rPr>
+      </w:pPr>
+      <w:r>
+        <w:rPr>
+          <w:rFonts w:ascii="Times New Roman" w:hAnsi="Times New Roman" w:cs="Times New Roman"/>
+          <w:color w:val="000000" w:themeColor="text1"/>
+          <w:sz w:val="28"/>
+          <w:szCs w:val="28"/>
+        </w:rPr>
+        <w:t xml:space="preserve">A method </w:t>
+      </w:r>
+      <w:proofErr w:type="spellStart"/>
+      <w:proofErr w:type="gramStart"/>
+      <w:r>
+        <w:rPr>
+          <w:rFonts w:ascii="Times New Roman" w:hAnsi="Times New Roman" w:cs="Times New Roman"/>
+          <w:color w:val="000000" w:themeColor="text1"/>
+          <w:sz w:val="28"/>
+          <w:szCs w:val="28"/>
+        </w:rPr>
+        <w:t>getPriceAfterUse</w:t>
+      </w:r>
+      <w:proofErr w:type="spellEnd"/>
+      <w:r>
+        <w:rPr>
+          <w:rFonts w:ascii="Times New Roman" w:hAnsi="Times New Roman" w:cs="Times New Roman"/>
+          <w:color w:val="000000" w:themeColor="text1"/>
+          <w:sz w:val="28"/>
+          <w:szCs w:val="28"/>
+        </w:rPr>
+        <w:t>(</w:t>
+      </w:r>
+      <w:proofErr w:type="gramEnd"/>
+      <w:r>
+        <w:rPr>
+          <w:rFonts w:ascii="Times New Roman" w:hAnsi="Times New Roman" w:cs="Times New Roman"/>
+          <w:color w:val="000000" w:themeColor="text1"/>
+          <w:sz w:val="28"/>
+          <w:szCs w:val="28"/>
+        </w:rPr>
+        <w:t>) which should return the price of the car after being used according to the following formula:</w:t>
+      </w:r>
+    </w:p>
+    <w:p>
+      <w:pPr>
+        <w:pStyle w:val="ListParagraph"/>
+        <w:spacing w:after="0" w:line="240" w:lineRule="auto"/>
+        <w:ind w:left="360"/>
+        <w:jc w:val="center"/>
+        <w:rPr>
+          <w:rFonts w:ascii="Times New Roman" w:hAnsi="Times New Roman" w:cs="Times New Roman"/>
+          <w:color w:val="000000" w:themeColor="text1"/>
+          <w:sz w:val="28"/>
+          <w:szCs w:val="28"/>
+        </w:rPr>
+      </w:pPr>
+      <w:r>
+        <w:rPr>
+          <w:rFonts w:ascii="Times New Roman" w:hAnsi="Times New Roman" w:cs="Times New Roman"/>
+          <w:color w:val="000000" w:themeColor="text1"/>
+          <w:sz w:val="28"/>
+          <w:szCs w:val="28"/>
+        </w:rPr>
+        <w:t>C</w:t>
+      </w:r>
+      <w:r>
+        <w:rPr>
+          <w:rFonts w:ascii="Times New Roman" w:hAnsi="Times New Roman" w:cs="Times New Roman"/>
+          <w:color w:val="000000" w:themeColor="text1"/>
+          <w:sz w:val="28"/>
+          <w:szCs w:val="28"/>
+        </w:rPr>
+        <w:t xml:space="preserve">ar </w:t>
+      </w:r>
+      <w:r>
+        <w:rPr>
+          <w:rFonts w:ascii="Times New Roman" w:hAnsi="Times New Roman" w:cs="Times New Roman"/>
+          <w:color w:val="000000" w:themeColor="text1"/>
+          <w:sz w:val="28"/>
+          <w:szCs w:val="28"/>
+        </w:rPr>
+        <w:t>p</w:t>
+      </w:r>
+      <w:r>
+        <w:rPr>
+          <w:rFonts w:ascii="Times New Roman" w:hAnsi="Times New Roman" w:cs="Times New Roman"/>
+          <w:color w:val="000000" w:themeColor="text1"/>
+          <w:sz w:val="28"/>
+          <w:szCs w:val="28"/>
+        </w:rPr>
+        <w:t>rice after being used=</w:t>
+      </w:r>
+      <w:proofErr w:type="spellStart"/>
+      <w:r>
+        <w:rPr>
+          <w:rFonts w:ascii="Times New Roman" w:hAnsi="Times New Roman" w:cs="Times New Roman"/>
+          <w:color w:val="000000" w:themeColor="text1"/>
+          <w:sz w:val="28"/>
+          <w:szCs w:val="28"/>
+        </w:rPr>
+        <w:t>priceNew</w:t>
+      </w:r>
+      <w:proofErr w:type="spellEnd"/>
+      <w:r>
+        <w:rPr>
+          <w:rFonts w:ascii="Times New Roman" w:hAnsi="Times New Roman" w:cs="Times New Roman"/>
+          <w:color w:val="000000" w:themeColor="text1"/>
+          <w:sz w:val="28"/>
+          <w:szCs w:val="28"/>
+        </w:rPr>
+        <w:t>*(1-(odometer/600,00))</w:t>
+      </w:r>
+    </w:p>
+    <w:p>
+      <w:pPr>
+        <w:pStyle w:val="ListParagraph"/>
+        <w:numPr>
+          <w:ilvl w:val="0"/>
+          <w:numId w:val="3"/>
+        </w:numPr>
+        <w:spacing w:before="240" w:after="0" w:line="240" w:lineRule="auto"/>
+        <w:jc w:val="both"/>
+        <w:rPr>
+          <w:rFonts w:ascii="Times New Roman" w:hAnsi="Times New Roman" w:cs="Times New Roman"/>
+          <w:color w:val="000000" w:themeColor="text1"/>
+          <w:sz w:val="28"/>
+          <w:szCs w:val="28"/>
+        </w:rPr>
+      </w:pPr>
+      <w:r>
+        <w:rPr>
+          <w:rFonts w:ascii="Times New Roman" w:hAnsi="Times New Roman" w:cs="Times New Roman"/>
+          <w:color w:val="000000" w:themeColor="text1"/>
+          <w:sz w:val="28"/>
+          <w:szCs w:val="28"/>
+        </w:rPr>
+        <w:t xml:space="preserve">A method </w:t>
+      </w:r>
+      <w:proofErr w:type="spellStart"/>
+      <w:r>
+        <w:rPr>
+          <w:rFonts w:ascii="Times New Roman" w:hAnsi="Times New Roman" w:cs="Times New Roman"/>
+          <w:color w:val="000000" w:themeColor="text1"/>
+          <w:sz w:val="28"/>
+          <w:szCs w:val="28"/>
+        </w:rPr>
+        <w:t>updateMilage</w:t>
+      </w:r>
+      <w:proofErr w:type="spellEnd"/>
+      <w:r>
+        <w:rPr>
+          <w:rFonts w:ascii="Times New Roman" w:hAnsi="Times New Roman" w:cs="Times New Roman"/>
+          <w:color w:val="000000" w:themeColor="text1"/>
+          <w:sz w:val="28"/>
+          <w:szCs w:val="28"/>
+        </w:rPr>
+        <w:t xml:space="preserve"> (double travelled distance) that changes the current state of the car by increasing its milage</w:t>
+      </w:r>
+      <w:r>
+        <w:rPr>
+          <w:rFonts w:ascii="Times New Roman" w:hAnsi="Times New Roman" w:cs="Times New Roman"/>
+          <w:color w:val="000000" w:themeColor="text1"/>
+          <w:sz w:val="28"/>
+          <w:szCs w:val="28"/>
+        </w:rPr>
+        <w:t>.</w:t>
+      </w:r>
+    </w:p>
+    <w:p>
+      <w:pPr>
+        <w:pStyle w:val="ListParagraph"/>
+        <w:numPr>
+          <w:ilvl w:val="0"/>
+          <w:numId w:val="3"/>
+        </w:numPr>
+        <w:spacing w:line="240" w:lineRule="auto"/>
+        <w:jc w:val="both"/>
+        <w:rPr>
+          <w:rFonts w:ascii="Times New Roman" w:hAnsi="Times New Roman" w:cs="Times New Roman"/>
+          <w:color w:val="000000" w:themeColor="text1"/>
+          <w:sz w:val="28"/>
+          <w:szCs w:val="28"/>
+        </w:rPr>
+      </w:pPr>
+      <w:r>
+        <w:rPr>
+          <w:rFonts w:ascii="Times New Roman" w:hAnsi="Times New Roman" w:cs="Times New Roman"/>
+          <w:color w:val="000000" w:themeColor="text1"/>
+          <w:sz w:val="28"/>
+          <w:szCs w:val="28"/>
+        </w:rPr>
+        <w:t xml:space="preserve">A method </w:t>
+      </w:r>
+      <w:proofErr w:type="spellStart"/>
+      <w:proofErr w:type="gramStart"/>
+      <w:r>
+        <w:rPr>
+          <w:rFonts w:ascii="Times New Roman" w:hAnsi="Times New Roman" w:cs="Times New Roman"/>
+          <w:color w:val="000000" w:themeColor="text1"/>
+          <w:sz w:val="28"/>
+          <w:szCs w:val="28"/>
+        </w:rPr>
+        <w:t>outputDetails</w:t>
+      </w:r>
+      <w:proofErr w:type="spellEnd"/>
+      <w:r>
+        <w:rPr>
+          <w:rFonts w:ascii="Times New Roman" w:hAnsi="Times New Roman" w:cs="Times New Roman"/>
+          <w:color w:val="000000" w:themeColor="text1"/>
+          <w:sz w:val="28"/>
+          <w:szCs w:val="28"/>
+        </w:rPr>
+        <w:t>(</w:t>
+      </w:r>
+      <w:proofErr w:type="gramEnd"/>
+      <w:r>
+        <w:rPr>
+          <w:rFonts w:ascii="Times New Roman" w:hAnsi="Times New Roman" w:cs="Times New Roman"/>
+          <w:color w:val="000000" w:themeColor="text1"/>
+          <w:sz w:val="28"/>
+          <w:szCs w:val="28"/>
+        </w:rPr>
+        <w:t xml:space="preserve">) that will output to the screen all the information of the car, i.e. </w:t>
+      </w:r>
+      <w:proofErr w:type="spellStart"/>
+      <w:r>
+        <w:rPr>
+          <w:rFonts w:ascii="Times New Roman" w:hAnsi="Times New Roman" w:cs="Times New Roman"/>
+          <w:color w:val="000000" w:themeColor="text1"/>
+          <w:sz w:val="28"/>
+          <w:szCs w:val="28"/>
+        </w:rPr>
+        <w:t>brandname</w:t>
+      </w:r>
+      <w:proofErr w:type="spellEnd"/>
+      <w:r>
+        <w:rPr>
+          <w:rFonts w:ascii="Times New Roman" w:hAnsi="Times New Roman" w:cs="Times New Roman"/>
+          <w:color w:val="000000" w:themeColor="text1"/>
+          <w:sz w:val="28"/>
+          <w:szCs w:val="28"/>
+        </w:rPr>
+        <w:t xml:space="preserve">, </w:t>
+      </w:r>
+      <w:proofErr w:type="spellStart"/>
+      <w:r>
+        <w:rPr>
+          <w:rFonts w:ascii="Times New Roman" w:hAnsi="Times New Roman" w:cs="Times New Roman"/>
+          <w:color w:val="000000" w:themeColor="text1"/>
+          <w:sz w:val="28"/>
+          <w:szCs w:val="28"/>
+        </w:rPr>
+        <w:t>priceNew</w:t>
+      </w:r>
+      <w:proofErr w:type="spellEnd"/>
+      <w:r>
+        <w:rPr>
+          <w:rFonts w:ascii="Times New Roman" w:hAnsi="Times New Roman" w:cs="Times New Roman"/>
+          <w:color w:val="000000" w:themeColor="text1"/>
+          <w:sz w:val="28"/>
+          <w:szCs w:val="28"/>
+        </w:rPr>
+        <w:t>,</w:t>
+      </w:r>
+      <w:r>
+        <w:rPr>
+          <w:rFonts w:ascii="Times New Roman" w:hAnsi="Times New Roman" w:cs="Times New Roman"/>
+          <w:color w:val="000000" w:themeColor="text1"/>
+          <w:sz w:val="28"/>
+          <w:szCs w:val="28"/>
+        </w:rPr>
+        <w:t xml:space="preserve"> </w:t>
+      </w:r>
+      <w:proofErr w:type="spellStart"/>
+      <w:r>
+        <w:rPr>
+          <w:rFonts w:ascii="Times New Roman" w:hAnsi="Times New Roman" w:cs="Times New Roman"/>
+          <w:color w:val="000000" w:themeColor="text1"/>
+          <w:sz w:val="28"/>
+          <w:szCs w:val="28"/>
+        </w:rPr>
+        <w:t>priceused</w:t>
+      </w:r>
+      <w:proofErr w:type="spellEnd"/>
+      <w:r>
+        <w:rPr>
+          <w:rFonts w:ascii="Times New Roman" w:hAnsi="Times New Roman" w:cs="Times New Roman"/>
+          <w:color w:val="000000" w:themeColor="text1"/>
+          <w:sz w:val="28"/>
+          <w:szCs w:val="28"/>
+        </w:rPr>
+        <w:t>,</w:t>
+      </w:r>
+      <w:r>
+        <w:rPr>
+          <w:rFonts w:ascii="Times New Roman" w:hAnsi="Times New Roman" w:cs="Times New Roman"/>
+          <w:color w:val="000000" w:themeColor="text1"/>
+          <w:sz w:val="28"/>
+          <w:szCs w:val="28"/>
+        </w:rPr>
+        <w:t xml:space="preserve"> </w:t>
+      </w:r>
+      <w:r>
+        <w:rPr>
+          <w:rFonts w:ascii="Times New Roman" w:hAnsi="Times New Roman" w:cs="Times New Roman"/>
+          <w:color w:val="000000" w:themeColor="text1"/>
+          <w:sz w:val="28"/>
+          <w:szCs w:val="28"/>
+        </w:rPr>
+        <w:t>color and odometer.</w:t>
+      </w:r>
+    </w:p>
+    <w:p>
+      <w:pPr>
+        <w:spacing w:line="256" w:lineRule="auto"/>
+        <w:jc w:val="both"/>
+        <w:rPr>
+          <w:rFonts w:ascii="Britannic Bold" w:hAnsi="Britannic Bold"/>
+          <w:color w:val="000000" w:themeColor="text1"/>
+          <w:sz w:val="28"/>
+          <w:szCs w:val="28"/>
+        </w:rPr>
+      </w:pPr>
+      <w:r>
+        <w:rPr>
+          <w:rFonts w:ascii="Britannic Bold" w:hAnsi="Britannic Bold"/>
+          <w:color w:val="000000" w:themeColor="text1"/>
+          <w:sz w:val="28"/>
+          <w:szCs w:val="28"/>
+        </w:rPr>
+        <w:t>Code:</w:t>
+      </w:r>
+    </w:p>
+    <w:p>
+      <w:pPr>
+        <w:rPr>
+          <w:rFonts w:ascii="Britannic Bold" w:hAnsi="Britannic Bold"/>
+          <w:color w:val="000000" w:themeColor="text1"/>
+          <w:sz w:val="28"/>
+          <w:szCs w:val="28"/>
+        </w:rPr>
+      </w:pPr>
+      <w:r>
+        <w:rPr>
+          <w:rFonts w:ascii="Britannic Bold" w:hAnsi="Britannic Bold"/>
+          <w:color w:val="000000" w:themeColor="text1"/>
+          <w:sz w:val="28"/>
+          <w:szCs w:val="28"/>
+        </w:rPr>
+        <w:t>Output:</w:t>
+      </w:r>
+    </w:p>
+    <w:p>
+      <w:pPr>
+        <w:rPr>
+          <w:rFonts w:ascii="Britannic Bold" w:hAnsi="Britannic Bold"/>
+          <w:color w:val="000000" w:themeColor="text1"/>
+          <w:sz w:val="28"/>
+          <w:szCs w:val="28"/>
+        </w:rPr>
+      </w:pPr>
+    </w:p>
     <w:sectPr>
-      <w:headerReference w:type="default" r:id="rId6"/>
-      <w:footerReference w:type="default" r:id="rId7"/>
+      <w:headerReference w:type="default" r:id="rId7"/>
+      <w:footerReference w:type="default" r:id="rId8"/>
       <w:pgSz w:w="12240" w:h="15840"/>
       <w:pgMar w:top="1440" w:right="1440" w:bottom="1440" w:left="1440" w:header="720" w:footer="720" w:gutter="0"/>
       <w:pgBorders w:offsetFrom="page">
@@ -221,6 +1144,142 @@
     </w:r>
   </w:p>
 </w:hdr>
+</file>
+
+<file path=word/numbering.xml><?xml version="1.0" encoding="utf-8"?>
+<w:numbering xmlns:wpc="http://schemas.microsoft.com/office/word/2010/wordprocessingCanvas" xmlns:cx="http://schemas.microsoft.com/office/drawing/2014/chartex" xmlns:cx1="http://schemas.microsoft.com/office/drawing/2015/9/8/chartex" xmlns:cx2="http://schemas.microsoft.com/office/drawing/2015/10/21/chartex" xmlns:cx3="http://schemas.microsoft.com/office/drawing/2016/5/9/chartex" xmlns:cx4="http://schemas.microsoft.com/office/drawing/2016/5/10/chartex" xmlns:cx5="http://schemas.microsoft.com/office/drawing/2016/5/11/chartex" xmlns:cx6="http://schemas.microsoft.com/office/drawing/2016/5/12/chartex" xmlns:cx7="http://schemas.microsoft.com/office/drawing/2016/5/13/chartex" xmlns:cx8="http://schemas.microsoft.com/office/drawing/2016/5/14/chartex" xmlns:mc="http://schemas.openxmlformats.org/markup-compatibility/2006" xmlns:aink="http://schemas.microsoft.com/office/drawing/2016/ink" xmlns:am3d="http://schemas.microsoft.com/office/drawing/2017/model3d" xmlns:o="urn:schemas-microsoft-com:office:office" xmlns:oel="http://schemas.microsoft.com/office/2019/extlst" xmlns:r="http://schemas.openxmlformats.org/officeDocument/2006/relationships" xmlns:m="http://schemas.openxmlformats.org/officeDocument/2006/math" xmlns:v="urn:schemas-microsoft-com:vml" xmlns:wp14="http://schemas.microsoft.com/office/word/2010/wordprocessingDrawing" xmlns:wp="http://schemas.openxmlformats.org/drawingml/2006/wordprocessingDrawing" xmlns:w10="urn:schemas-microsoft-com:office:word" xmlns:w="http://schemas.openxmlformats.org/wordprocessingml/2006/main" xmlns:w14="http://schemas.microsoft.com/office/word/2010/wordml" xmlns:w15="http://schemas.microsoft.com/office/word/2012/wordml" xmlns:w16cex="http://schemas.microsoft.com/office/word/2018/wordml/cex" xmlns:w16cid="http://schemas.microsoft.com/office/word/2016/wordml/cid" xmlns:w16="http://schemas.microsoft.com/office/word/2018/wordml" xmlns:w16sdtdh="http://schemas.microsoft.com/office/word/2020/wordml/sdtdatahash" xmlns:w16se="http://schemas.microsoft.com/office/word/2015/wordml/symex" xmlns:wpg="http://schemas.microsoft.com/office/word/2010/wordprocessingGroup" xmlns:wpi="http://schemas.microsoft.com/office/word/2010/wordprocessingInk" xmlns:wne="http://schemas.microsoft.com/office/word/2006/wordml" xmlns:wps="http://schemas.microsoft.com/office/word/2010/wordprocessingShape" mc:Ignorable="w14 w15 w16se w16cid w16 w16cex w16sdtdh wp14">
+  <w:abstractNum w:abstractNumId="0" w15:restartNumberingAfterBreak="0">
+    <w:nsid w:val="36396610"/>
+    <w:multiLevelType w:val="hybridMultilevel"/>
+    <w:tmpl w:val="7196E6AC"/>
+    <w:lvl w:ilvl="0" w:tplc="0409000F">
+      <w:start w:val="1"/>
+      <w:numFmt w:val="decimal"/>
+      <w:lvlText w:val="%1."/>
+      <w:lvlJc w:val="left"/>
+      <w:pPr>
+        <w:ind w:left="360" w:hanging="360"/>
+      </w:pPr>
+    </w:lvl>
+    <w:lvl w:ilvl="1" w:tplc="04090019" w:tentative="1">
+      <w:start w:val="1"/>
+      <w:numFmt w:val="lowerLetter"/>
+      <w:lvlText w:val="%2."/>
+      <w:lvlJc w:val="left"/>
+      <w:pPr>
+        <w:ind w:left="1080" w:hanging="360"/>
+      </w:pPr>
+    </w:lvl>
+    <w:lvl w:ilvl="2" w:tplc="0409001B" w:tentative="1">
+      <w:start w:val="1"/>
+      <w:numFmt w:val="lowerRoman"/>
+      <w:lvlText w:val="%3."/>
+      <w:lvlJc w:val="right"/>
+      <w:pPr>
+        <w:ind w:left="1800" w:hanging="180"/>
+      </w:pPr>
+    </w:lvl>
+    <w:lvl w:ilvl="3" w:tplc="0409000F" w:tentative="1">
+      <w:start w:val="1"/>
+      <w:numFmt w:val="decimal"/>
+      <w:lvlText w:val="%4."/>
+      <w:lvlJc w:val="left"/>
+      <w:pPr>
+        <w:ind w:left="2520" w:hanging="360"/>
+      </w:pPr>
+    </w:lvl>
+    <w:lvl w:ilvl="4" w:tplc="04090019" w:tentative="1">
+      <w:start w:val="1"/>
+      <w:numFmt w:val="lowerLetter"/>
+      <w:lvlText w:val="%5."/>
+      <w:lvlJc w:val="left"/>
+      <w:pPr>
+        <w:ind w:left="3240" w:hanging="360"/>
+      </w:pPr>
+    </w:lvl>
+    <w:lvl w:ilvl="5" w:tplc="0409001B" w:tentative="1">
+      <w:start w:val="1"/>
+      <w:numFmt w:val="lowerRoman"/>
+      <w:lvlText w:val="%6."/>
+      <w:lvlJc w:val="right"/>
+      <w:pPr>
+        <w:ind w:left="3960" w:hanging="180"/>
+      </w:pPr>
+    </w:lvl>
+    <w:lvl w:ilvl="6" w:tplc="0409000F" w:tentative="1">
+      <w:start w:val="1"/>
+      <w:numFmt w:val="decimal"/>
+      <w:lvlText w:val="%7."/>
+      <w:lvlJc w:val="left"/>
+      <w:pPr>
+        <w:ind w:left="4680" w:hanging="360"/>
+      </w:pPr>
+    </w:lvl>
+    <w:lvl w:ilvl="7" w:tplc="04090019" w:tentative="1">
+      <w:start w:val="1"/>
+      <w:numFmt w:val="lowerLetter"/>
+      <w:lvlText w:val="%8."/>
+      <w:lvlJc w:val="left"/>
+      <w:pPr>
+        <w:ind w:left="5400" w:hanging="360"/>
+      </w:pPr>
+    </w:lvl>
+    <w:lvl w:ilvl="8" w:tplc="0409001B" w:tentative="1">
+      <w:start w:val="1"/>
+      <w:numFmt w:val="lowerRoman"/>
+      <w:lvlText w:val="%9."/>
+      <w:lvlJc w:val="right"/>
+      <w:pPr>
+        <w:ind w:left="6120" w:hanging="180"/>
+      </w:pPr>
+    </w:lvl>
+  </w:abstractNum>
+  <w:abstractNum w:abstractNumId="1" w15:restartNumberingAfterBreak="0">
+    <w:nsid w:val="4F7A8396"/>
+    <w:multiLevelType w:val="singleLevel"/>
+    <w:tmpl w:val="4F7A8396"/>
+    <w:lvl w:ilvl="0">
+      <w:start w:val="1"/>
+      <w:numFmt w:val="decimal"/>
+      <w:suff w:val="space"/>
+      <w:lvlText w:val="%1."/>
+      <w:lvlJc w:val="left"/>
+      <w:pPr>
+        <w:ind w:left="0" w:firstLine="0"/>
+      </w:pPr>
+    </w:lvl>
+  </w:abstractNum>
+  <w:abstractNum w:abstractNumId="2" w15:restartNumberingAfterBreak="0">
+    <w:nsid w:val="56A35A2F"/>
+    <w:multiLevelType w:val="singleLevel"/>
+    <w:tmpl w:val="56A35A2F"/>
+    <w:lvl w:ilvl="0">
+      <w:start w:val="3"/>
+      <w:numFmt w:val="upperLetter"/>
+      <w:suff w:val="space"/>
+      <w:lvlText w:val="%1."/>
+      <w:lvlJc w:val="left"/>
+      <w:pPr>
+        <w:ind w:left="0" w:firstLine="0"/>
+      </w:pPr>
+    </w:lvl>
+  </w:abstractNum>
+  <w:num w:numId="1" w16cid:durableId="1499421041">
+    <w:abstractNumId w:val="1"/>
+    <w:lvlOverride w:ilvl="0">
+      <w:startOverride w:val="1"/>
+    </w:lvlOverride>
+  </w:num>
+  <w:num w:numId="2" w16cid:durableId="2018533509">
+    <w:abstractNumId w:val="2"/>
+    <w:lvlOverride w:ilvl="0">
+      <w:startOverride w:val="3"/>
+    </w:lvlOverride>
+  </w:num>
+  <w:num w:numId="3" w16cid:durableId="381560962">
+    <w:abstractNumId w:val="0"/>
+  </w:num>
+</w:numbering>
 </file>
 
 <file path=word/styles.xml><?xml version="1.0" encoding="utf-8"?>
@@ -702,6 +1761,17 @@
     <w:uiPriority w:val="99"/>
     <w:rsid w:val="00CF66A4"/>
   </w:style>
+  <w:style w:type="paragraph" w:styleId="ListParagraph">
+    <w:name w:val="List Paragraph"/>
+    <w:basedOn w:val="Normal"/>
+    <w:uiPriority w:val="34"/>
+    <w:qFormat/>
+    <w:rsid w:val="0031791D"/>
+    <w:pPr>
+      <w:ind w:left="720"/>
+      <w:contextualSpacing/>
+    </w:pPr>
+  </w:style>
 </w:styles>
 </file>
 

</xml_diff>